<commit_message>
W3D4: Apply Word layout styling - header formatting, column widths, borders
</commit_message>
<xml_diff>
--- a/GoldCustomerReport.docx
+++ b/GoldCustomerReport.docx
@@ -5,63 +5,130 @@
     <w:tbl>
       <w:tblPr>
         <w:tblStyle w:val="TableGrid"/>
+        <w:tblpPr w:leftFromText="180" w:rightFromText="180" w:vertAnchor="text" w:horzAnchor="margin" w:tblpY="960"/>
         <w:tblW w:w="0" w:type="auto"/>
+        <w:tblLayout w:type="fixed"/>
         <w:tblLook w:val="04A0" w:firstRow="1" w:lastRow="0" w:firstColumn="1" w:lastColumn="0" w:noHBand="0" w:noVBand="1"/>
       </w:tblPr>
       <w:tblGrid>
-        <w:gridCol w:w="1600"/>
-        <w:gridCol w:w="1664"/>
-        <w:gridCol w:w="1816"/>
-        <w:gridCol w:w="2658"/>
-        <w:gridCol w:w="1890"/>
+        <w:gridCol w:w="1440"/>
+        <w:gridCol w:w="3168"/>
+        <w:gridCol w:w="1728"/>
+        <w:gridCol w:w="2016"/>
+        <w:gridCol w:w="1728"/>
       </w:tblGrid>
       <w:tr>
         <w:tc>
           <w:tcPr>
-            <w:tcW w:w="1925" w:type="dxa"/>
+            <w:tcW w:w="1440" w:type="dxa"/>
+            <w:shd w:val="clear" w:color="auto" w:fill="153D63" w:themeFill="text2" w:themeFillTint="E6"/>
           </w:tcPr>
           <w:p>
+            <w:pPr>
+              <w:rPr>
+                <w:b/>
+                <w:bCs/>
+                <w:color w:val="FFFFFF" w:themeColor="background1"/>
+              </w:rPr>
+            </w:pPr>
             <w:r>
+              <w:rPr>
+                <w:b/>
+                <w:bCs/>
+                <w:color w:val="FFFFFF" w:themeColor="background1"/>
+              </w:rPr>
               <w:t>No.</w:t>
             </w:r>
           </w:p>
         </w:tc>
         <w:tc>
           <w:tcPr>
-            <w:tcW w:w="1925" w:type="dxa"/>
+            <w:tcW w:w="3168" w:type="dxa"/>
+            <w:shd w:val="clear" w:color="auto" w:fill="153D63" w:themeFill="text2" w:themeFillTint="E6"/>
           </w:tcPr>
           <w:p>
+            <w:pPr>
+              <w:rPr>
+                <w:b/>
+                <w:bCs/>
+                <w:color w:val="FFFFFF" w:themeColor="background1"/>
+              </w:rPr>
+            </w:pPr>
             <w:r>
+              <w:rPr>
+                <w:b/>
+                <w:bCs/>
+                <w:color w:val="FFFFFF" w:themeColor="background1"/>
+              </w:rPr>
               <w:t>Name</w:t>
             </w:r>
           </w:p>
         </w:tc>
         <w:tc>
           <w:tcPr>
-            <w:tcW w:w="1926" w:type="dxa"/>
+            <w:tcW w:w="1728" w:type="dxa"/>
+            <w:shd w:val="clear" w:color="auto" w:fill="153D63" w:themeFill="text2" w:themeFillTint="E6"/>
           </w:tcPr>
           <w:p>
+            <w:pPr>
+              <w:rPr>
+                <w:b/>
+                <w:bCs/>
+                <w:color w:val="FFFFFF" w:themeColor="background1"/>
+              </w:rPr>
+            </w:pPr>
             <w:r>
+              <w:rPr>
+                <w:b/>
+                <w:bCs/>
+                <w:color w:val="FFFFFF" w:themeColor="background1"/>
+              </w:rPr>
               <w:t>Balance</w:t>
             </w:r>
           </w:p>
         </w:tc>
         <w:tc>
           <w:tcPr>
-            <w:tcW w:w="1926" w:type="dxa"/>
+            <w:tcW w:w="2016" w:type="dxa"/>
+            <w:shd w:val="clear" w:color="auto" w:fill="153D63" w:themeFill="text2" w:themeFillTint="E6"/>
           </w:tcPr>
           <w:p>
+            <w:pPr>
+              <w:rPr>
+                <w:b/>
+                <w:bCs/>
+                <w:color w:val="FFFFFF" w:themeColor="background1"/>
+              </w:rPr>
+            </w:pPr>
             <w:r>
+              <w:rPr>
+                <w:b/>
+                <w:bCs/>
+                <w:color w:val="FFFFFF" w:themeColor="background1"/>
+              </w:rPr>
               <w:t>Posting Group</w:t>
             </w:r>
           </w:p>
         </w:tc>
         <w:tc>
           <w:tcPr>
-            <w:tcW w:w="1926" w:type="dxa"/>
+            <w:tcW w:w="1728" w:type="dxa"/>
+            <w:shd w:val="clear" w:color="auto" w:fill="153D63" w:themeFill="text2" w:themeFillTint="E6"/>
           </w:tcPr>
           <w:p>
+            <w:pPr>
+              <w:rPr>
+                <w:b/>
+                <w:bCs/>
+                <w:color w:val="FFFFFF" w:themeColor="background1"/>
+              </w:rPr>
+            </w:pPr>
             <w:r>
+              <w:rPr>
+                <w:b/>
+                <w:bCs/>
+                <w:color w:val="FFFFFF" w:themeColor="background1"/>
+              </w:rPr>
               <w:t>Credit Limit</w:t>
             </w:r>
           </w:p>
@@ -69,18 +136,28 @@
       </w:tr>
       <w:sdt>
         <w:sdtPr>
+          <w:rPr>
+            <w:rFonts w:ascii="Arial" w:hAnsi="Arial" w:cs="Arial"/>
+            <w:sz w:val="22"/>
+            <w:szCs w:val="22"/>
+          </w:rPr>
+          <w:alias w:val="#Nav: /Customer"/>
+          <w:tag w:val="#Nav: Gold_Customer_Report/50110"/>
           <w:id w:val="-1438287408"/>
           <w15:dataBinding w:prefixMappings="xmlns:ns0='urn:microsoft-dynamics-nav/reports/Gold_Customer_Report/50110/' " w:xpath="/ns0:NavWordReportXmlPart[1]/ns0:Customer" w:storeItemID="{A6B69A3E-D27D-4DC1-B85E-6A3637EC02EF}"/>
           <w15:repeatingSection/>
-          <w:alias w:val="#Nav: /Customer"/>
-          <w:tag w:val="#Nav: Gold_Customer_Report/50110"/>
         </w:sdtPr>
         <w:sdtContent>
           <w:sdt>
             <w:sdtPr>
+              <w:rPr>
+                <w:rFonts w:ascii="Arial" w:hAnsi="Arial" w:cs="Arial"/>
+                <w:sz w:val="22"/>
+                <w:szCs w:val="22"/>
+              </w:rPr>
               <w:id w:val="1631675663"/>
               <w:placeholder>
-                <w:docPart w:val="DefaultPlaceholder_-1854013435"/>
+                <w:docPart w:val="5E166907CAC349688074792E2E979A0F"/>
               </w:placeholder>
               <w15:repeatingSectionItem/>
             </w:sdtPr>
@@ -88,22 +165,39 @@
               <w:tr>
                 <w:sdt>
                   <w:sdtPr>
+                    <w:rPr>
+                      <w:rFonts w:ascii="Arial" w:hAnsi="Arial" w:cs="Arial"/>
+                      <w:sz w:val="22"/>
+                      <w:szCs w:val="22"/>
+                    </w:rPr>
+                    <w:alias w:val="#Nav: /Customer/No"/>
+                    <w:tag w:val="#Nav: Gold_Customer_Report/50110"/>
                     <w:id w:val="-2131615398"/>
                     <w:placeholder>
-                      <w:docPart w:val="DefaultPlaceholder_-1854013440"/>
+                      <w:docPart w:val="B0DFB5D9C73D4792BAC1FB4BB8F56E61"/>
                     </w:placeholder>
                     <w:dataBinding w:prefixMappings="xmlns:ns0='urn:microsoft-dynamics-nav/reports/Gold_Customer_Report/50110/' " w:xpath="/ns0:NavWordReportXmlPart[1]/ns0:Customer[1]/ns0:No[1]" w:storeItemID="{A6B69A3E-D27D-4DC1-B85E-6A3637EC02EF}"/>
                     <w:text/>
-                    <w:alias w:val="#Nav: /Customer/No"/>
-                    <w:tag w:val="#Nav: Gold_Customer_Report/50110"/>
                   </w:sdtPr>
                   <w:sdtContent>
                     <w:tc>
                       <w:tcPr>
-                        <w:tcW w:w="1925" w:type="dxa"/>
+                        <w:tcW w:w="1440" w:type="dxa"/>
                       </w:tcPr>
                       <w:p>
+                        <w:pPr>
+                          <w:rPr>
+                            <w:rFonts w:ascii="Arial" w:hAnsi="Arial" w:cs="Arial"/>
+                            <w:sz w:val="22"/>
+                            <w:szCs w:val="22"/>
+                          </w:rPr>
+                        </w:pPr>
                         <w:r>
+                          <w:rPr>
+                            <w:rFonts w:ascii="Arial" w:hAnsi="Arial" w:cs="Arial"/>
+                            <w:sz w:val="22"/>
+                            <w:szCs w:val="22"/>
+                          </w:rPr>
                           <w:t>No</w:t>
                         </w:r>
                       </w:p>
@@ -112,22 +206,39 @@
                 </w:sdt>
                 <w:sdt>
                   <w:sdtPr>
+                    <w:rPr>
+                      <w:rFonts w:ascii="Arial" w:hAnsi="Arial" w:cs="Arial"/>
+                      <w:sz w:val="22"/>
+                      <w:szCs w:val="22"/>
+                    </w:rPr>
+                    <w:alias w:val="#Nav: /Customer/Name"/>
+                    <w:tag w:val="#Nav: Gold_Customer_Report/50110"/>
                     <w:id w:val="462541952"/>
                     <w:placeholder>
-                      <w:docPart w:val="DefaultPlaceholder_-1854013440"/>
+                      <w:docPart w:val="B0DFB5D9C73D4792BAC1FB4BB8F56E61"/>
                     </w:placeholder>
                     <w:dataBinding w:prefixMappings="xmlns:ns0='urn:microsoft-dynamics-nav/reports/Gold_Customer_Report/50110/' " w:xpath="/ns0:NavWordReportXmlPart[1]/ns0:Customer[1]/ns0:Name[1]" w:storeItemID="{A6B69A3E-D27D-4DC1-B85E-6A3637EC02EF}"/>
                     <w:text/>
-                    <w:alias w:val="#Nav: /Customer/Name"/>
-                    <w:tag w:val="#Nav: Gold_Customer_Report/50110"/>
                   </w:sdtPr>
                   <w:sdtContent>
                     <w:tc>
                       <w:tcPr>
-                        <w:tcW w:w="1925" w:type="dxa"/>
+                        <w:tcW w:w="3168" w:type="dxa"/>
                       </w:tcPr>
                       <w:p>
+                        <w:pPr>
+                          <w:rPr>
+                            <w:rFonts w:ascii="Arial" w:hAnsi="Arial" w:cs="Arial"/>
+                            <w:sz w:val="22"/>
+                            <w:szCs w:val="22"/>
+                          </w:rPr>
+                        </w:pPr>
                         <w:r>
+                          <w:rPr>
+                            <w:rFonts w:ascii="Arial" w:hAnsi="Arial" w:cs="Arial"/>
+                            <w:sz w:val="22"/>
+                            <w:szCs w:val="22"/>
+                          </w:rPr>
                           <w:t>Name</w:t>
                         </w:r>
                       </w:p>
@@ -136,23 +247,40 @@
                 </w:sdt>
                 <w:sdt>
                   <w:sdtPr>
+                    <w:rPr>
+                      <w:rFonts w:ascii="Arial" w:hAnsi="Arial" w:cs="Arial"/>
+                      <w:sz w:val="22"/>
+                      <w:szCs w:val="22"/>
+                    </w:rPr>
+                    <w:alias w:val="#Nav: /Customer/BalanceLCY"/>
+                    <w:tag w:val="#Nav: Gold_Customer_Report/50110"/>
                     <w:id w:val="-2139326276"/>
                     <w:placeholder>
-                      <w:docPart w:val="DefaultPlaceholder_-1854013440"/>
+                      <w:docPart w:val="B0DFB5D9C73D4792BAC1FB4BB8F56E61"/>
                     </w:placeholder>
                     <w:dataBinding w:prefixMappings="xmlns:ns0='urn:microsoft-dynamics-nav/reports/Gold_Customer_Report/50110/' " w:xpath="/ns0:NavWordReportXmlPart[1]/ns0:Customer[1]/ns0:BalanceLCY[1]" w:storeItemID="{A6B69A3E-D27D-4DC1-B85E-6A3637EC02EF}"/>
                     <w:text/>
-                    <w:alias w:val="#Nav: /Customer/BalanceLCY"/>
-                    <w:tag w:val="#Nav: Gold_Customer_Report/50110"/>
                   </w:sdtPr>
                   <w:sdtContent>
                     <w:tc>
                       <w:tcPr>
-                        <w:tcW w:w="1926" w:type="dxa"/>
+                        <w:tcW w:w="1728" w:type="dxa"/>
                       </w:tcPr>
                       <w:p>
+                        <w:pPr>
+                          <w:rPr>
+                            <w:rFonts w:ascii="Arial" w:hAnsi="Arial" w:cs="Arial"/>
+                            <w:sz w:val="22"/>
+                            <w:szCs w:val="22"/>
+                          </w:rPr>
+                        </w:pPr>
                         <w:proofErr w:type="spellStart"/>
                         <w:r>
+                          <w:rPr>
+                            <w:rFonts w:ascii="Arial" w:hAnsi="Arial" w:cs="Arial"/>
+                            <w:sz w:val="22"/>
+                            <w:szCs w:val="22"/>
+                          </w:rPr>
                           <w:t>BalanceLCY</w:t>
                         </w:r>
                         <w:proofErr w:type="spellEnd"/>
@@ -162,23 +290,40 @@
                 </w:sdt>
                 <w:sdt>
                   <w:sdtPr>
+                    <w:rPr>
+                      <w:rFonts w:ascii="Arial" w:hAnsi="Arial" w:cs="Arial"/>
+                      <w:sz w:val="22"/>
+                      <w:szCs w:val="22"/>
+                    </w:rPr>
+                    <w:alias w:val="#Nav: /Customer/CustomerPostingGroup"/>
+                    <w:tag w:val="#Nav: Gold_Customer_Report/50110"/>
                     <w:id w:val="2069531344"/>
                     <w:placeholder>
-                      <w:docPart w:val="DefaultPlaceholder_-1854013440"/>
+                      <w:docPart w:val="B0DFB5D9C73D4792BAC1FB4BB8F56E61"/>
                     </w:placeholder>
                     <w:dataBinding w:prefixMappings="xmlns:ns0='urn:microsoft-dynamics-nav/reports/Gold_Customer_Report/50110/' " w:xpath="/ns0:NavWordReportXmlPart[1]/ns0:Customer[1]/ns0:CustomerPostingGroup[1]" w:storeItemID="{A6B69A3E-D27D-4DC1-B85E-6A3637EC02EF}"/>
                     <w:text/>
-                    <w:alias w:val="#Nav: /Customer/CustomerPostingGroup"/>
-                    <w:tag w:val="#Nav: Gold_Customer_Report/50110"/>
                   </w:sdtPr>
                   <w:sdtContent>
                     <w:tc>
                       <w:tcPr>
-                        <w:tcW w:w="1926" w:type="dxa"/>
+                        <w:tcW w:w="2016" w:type="dxa"/>
                       </w:tcPr>
                       <w:p>
+                        <w:pPr>
+                          <w:rPr>
+                            <w:rFonts w:ascii="Arial" w:hAnsi="Arial" w:cs="Arial"/>
+                            <w:sz w:val="22"/>
+                            <w:szCs w:val="22"/>
+                          </w:rPr>
+                        </w:pPr>
                         <w:proofErr w:type="spellStart"/>
                         <w:r>
+                          <w:rPr>
+                            <w:rFonts w:ascii="Arial" w:hAnsi="Arial" w:cs="Arial"/>
+                            <w:sz w:val="22"/>
+                            <w:szCs w:val="22"/>
+                          </w:rPr>
                           <w:t>CustomerPostingGroup</w:t>
                         </w:r>
                         <w:proofErr w:type="spellEnd"/>
@@ -188,23 +333,40 @@
                 </w:sdt>
                 <w:sdt>
                   <w:sdtPr>
+                    <w:rPr>
+                      <w:rFonts w:ascii="Arial" w:hAnsi="Arial" w:cs="Arial"/>
+                      <w:sz w:val="22"/>
+                      <w:szCs w:val="22"/>
+                    </w:rPr>
+                    <w:alias w:val="#Nav: /Customer/CreditLimitLCY"/>
+                    <w:tag w:val="#Nav: Gold_Customer_Report/50110"/>
                     <w:id w:val="-1478912556"/>
                     <w:placeholder>
-                      <w:docPart w:val="DefaultPlaceholder_-1854013440"/>
+                      <w:docPart w:val="B0DFB5D9C73D4792BAC1FB4BB8F56E61"/>
                     </w:placeholder>
                     <w:dataBinding w:prefixMappings="xmlns:ns0='urn:microsoft-dynamics-nav/reports/Gold_Customer_Report/50110/' " w:xpath="/ns0:NavWordReportXmlPart[1]/ns0:Customer[1]/ns0:CreditLimitLCY[1]" w:storeItemID="{A6B69A3E-D27D-4DC1-B85E-6A3637EC02EF}"/>
                     <w:text/>
-                    <w:alias w:val="#Nav: /Customer/CreditLimitLCY"/>
-                    <w:tag w:val="#Nav: Gold_Customer_Report/50110"/>
                   </w:sdtPr>
                   <w:sdtContent>
                     <w:tc>
                       <w:tcPr>
-                        <w:tcW w:w="1926" w:type="dxa"/>
+                        <w:tcW w:w="1728" w:type="dxa"/>
                       </w:tcPr>
                       <w:p>
+                        <w:pPr>
+                          <w:rPr>
+                            <w:rFonts w:ascii="Arial" w:hAnsi="Arial" w:cs="Arial"/>
+                            <w:sz w:val="22"/>
+                            <w:szCs w:val="22"/>
+                          </w:rPr>
+                        </w:pPr>
                         <w:proofErr w:type="spellStart"/>
                         <w:r>
+                          <w:rPr>
+                            <w:rFonts w:ascii="Arial" w:hAnsi="Arial" w:cs="Arial"/>
+                            <w:sz w:val="22"/>
+                            <w:szCs w:val="22"/>
+                          </w:rPr>
                           <w:t>CreditLimitLCY</w:t>
                         </w:r>
                         <w:proofErr w:type="spellEnd"/>
@@ -218,7 +380,37 @@
         </w:sdtContent>
       </w:sdt>
     </w:tbl>
-    <w:p/>
+    <w:p>
+      <w:pPr>
+        <w:jc w:val="center"/>
+        <w:rPr>
+          <w:b/>
+          <w:bCs/>
+          <w:sz w:val="32"/>
+          <w:szCs w:val="32"/>
+        </w:rPr>
+      </w:pPr>
+      <w:r>
+        <w:rPr>
+          <w:b/>
+          <w:bCs/>
+          <w:sz w:val="32"/>
+          <w:szCs w:val="32"/>
+        </w:rPr>
+        <w:t>Gold Customer Report</w:t>
+      </w:r>
+    </w:p>
+    <w:p>
+      <w:pPr>
+        <w:jc w:val="center"/>
+        <w:rPr>
+          <w:b/>
+          <w:bCs/>
+          <w:sz w:val="32"/>
+          <w:szCs w:val="32"/>
+        </w:rPr>
+      </w:pPr>
+    </w:p>
     <w:sectPr>
       <w:pgSz w:w="11906" w:h="16838"/>
       <w:pgMar w:top="1701" w:right="1134" w:bottom="1701" w:left="1134" w:header="708" w:footer="708" w:gutter="0"/>
@@ -693,7 +885,7 @@
   <w:docParts>
     <w:docPart>
       <w:docPartPr>
-        <w:name w:val="DefaultPlaceholder_-1854013435"/>
+        <w:name w:val="5E166907CAC349688074792E2E979A0F"/>
         <w:category>
           <w:name w:val="General"/>
           <w:gallery w:val="placeholder"/>
@@ -704,10 +896,13 @@
         <w:behaviors>
           <w:behavior w:val="content"/>
         </w:behaviors>
-        <w:guid w:val="{DC95FCC6-0F40-4086-9CFA-D981DA97314D}"/>
+        <w:guid w:val="{22FFABD2-C1E6-4E24-942D-D92736059C31}"/>
       </w:docPartPr>
       <w:docPartBody>
         <w:p>
+          <w:pPr>
+            <w:pStyle w:val="5E166907CAC349688074792E2E979A0F"/>
+          </w:pPr>
           <w:r>
             <w:rPr>
               <w:rStyle w:val="PlaceholderText"/>
@@ -719,7 +914,7 @@
     </w:docPart>
     <w:docPart>
       <w:docPartPr>
-        <w:name w:val="DefaultPlaceholder_-1854013440"/>
+        <w:name w:val="B0DFB5D9C73D4792BAC1FB4BB8F56E61"/>
         <w:category>
           <w:name w:val="General"/>
           <w:gallery w:val="placeholder"/>
@@ -730,10 +925,13 @@
         <w:behaviors>
           <w:behavior w:val="content"/>
         </w:behaviors>
-        <w:guid w:val="{4DBD6EC6-5714-4412-BA90-9C9D898A1636}"/>
+        <w:guid w:val="{3CFFD12A-B90E-4EE4-A0FD-829EB893160F}"/>
       </w:docPartPr>
       <w:docPartBody>
         <w:p>
+          <w:pPr>
+            <w:pStyle w:val="B0DFB5D9C73D4792BAC1FB4BB8F56E61"/>
+          </w:pPr>
           <w:r>
             <w:rPr>
               <w:rStyle w:val="PlaceholderText"/>
@@ -759,6 +957,13 @@
     <w:panose1 w:val="02020603050405020304"/>
     <w:charset w:val="00"/>
     <w:family w:val="roman"/>
+    <w:pitch w:val="variable"/>
+    <w:sig w:usb0="E0002EFF" w:usb1="C000785B" w:usb2="00000009" w:usb3="00000000" w:csb0="000001FF" w:csb1="00000000"/>
+  </w:font>
+  <w:font w:name="Arial">
+    <w:panose1 w:val="020B0604020202020204"/>
+    <w:charset w:val="00"/>
+    <w:family w:val="swiss"/>
     <w:pitch w:val="variable"/>
     <w:sig w:usb0="E0002EFF" w:usb1="C000785B" w:usb2="00000009" w:usb3="00000000" w:csb0="000001FF" w:csb1="00000000"/>
   </w:font>
@@ -788,8 +993,11 @@
   <w:rsids>
     <w:rsidRoot w:val="004E7393"/>
     <w:rsid w:val="000001B5"/>
+    <w:rsid w:val="00127CFC"/>
     <w:rsid w:val="004E7393"/>
+    <w:rsid w:val="00537A77"/>
     <w:rsid w:val="00DD636D"/>
+    <w:rsid w:val="00E4714B"/>
   </w:rsids>
   <m:mathPr>
     <m:mathFont m:val="Cambria Math"/>
@@ -1245,10 +1453,26 @@
     <w:basedOn w:val="DefaultParagraphFont"/>
     <w:uiPriority w:val="99"/>
     <w:semiHidden/>
-    <w:rsid w:val="004E7393"/>
+    <w:rsid w:val="00537A77"/>
     <w:rPr>
       <w:color w:val="666666"/>
     </w:rPr>
+  </w:style>
+  <w:style w:type="paragraph" w:customStyle="1" w:styleId="8823329B4D684469ADC40A257F932253">
+    <w:name w:val="8823329B4D684469ADC40A257F932253"/>
+    <w:rsid w:val="00537A77"/>
+  </w:style>
+  <w:style w:type="paragraph" w:customStyle="1" w:styleId="63EC00A0A8F74AFDB23A01A15B1B0F0D">
+    <w:name w:val="63EC00A0A8F74AFDB23A01A15B1B0F0D"/>
+    <w:rsid w:val="00537A77"/>
+  </w:style>
+  <w:style w:type="paragraph" w:customStyle="1" w:styleId="5E166907CAC349688074792E2E979A0F">
+    <w:name w:val="5E166907CAC349688074792E2E979A0F"/>
+    <w:rsid w:val="00537A77"/>
+  </w:style>
+  <w:style w:type="paragraph" w:customStyle="1" w:styleId="B0DFB5D9C73D4792BAC1FB4BB8F56E61">
+    <w:name w:val="B0DFB5D9C73D4792BAC1FB4BB8F56E61"/>
+    <w:rsid w:val="00537A77"/>
   </w:style>
 </w:styles>
 </file>
@@ -1575,7 +1799,7 @@
 </a:theme>
 </file>
 
-<file path=customXml/item1.xml>��< ? x m l   v e r s i o n = " 1 . 0 "   e n c o d i n g = " u t f - 1 6 " ? > < N a v W o r d R e p o r t X m l P a r t   x m l n s = " u r n : m i c r o s o f t - d y n a m i c s - b u s i n e s s c e n t r a l / i n t e r n a l / e x t e n d e d / r e p o r t s / G o l d _ C u s t o m e r _ R e p o r t / 5 0 1 1 0 / " > +<file path=customXml/item1.xml>��< ? x m l   v e r s i o n = " 1 . 0 "   e n c o d i n g = " u t f - 1 6 " ? > < N a v W o r d R e p o r t X m l P a r t   x m l n s = " u r n : m i c r o s o f t - d y n a m i c s - n a v / r e p o r t s / G o l d _ C u s t o m e r _ R e p o r t / 5 0 1 1 0 / " >   
      < B C R e p o r t I n f o r m a t i o n >   
@@ -1641,58 +1865,24 @@
  
      < / B C R e p o r t I n f o r m a t i o n >   
-     < T o o l t i p s > - 
-         < T o o l t i p   c o l u m n = " N o "   E l e m e n t I d = " 1 1 9 8 2 6 8 3 4 0 " > - 
-             < T o o l t i p T e x t   l a n g = " e n - U S " > S p e c i f i e s   t h e   n u m b e r   o f   t h e   c u s t o m e r .   T h e   f i e l d   i s   e i t h e r   f i l l e d   a u t o m a t i c a l l y   f r o m   a   d e f i n e d   n u m b e r   s e r i e s ,   o r   y o u   e n t e r   t h e   n u m b e r   m a n u a l l y   b e c a u s e   y o u   h a v e   e n a b l e d   m a n u a l   n u m b e r   e n t r y   i n   t h e   n u m b e r - s e r i e s   s e t u p . < / T o o l t i p T e x t > - 
-         < / T o o l t i p > - 
-         < T o o l t i p   c o l u m n = " N a m e "   E l e m e n t I d = " 8 1 4 0 6 8 7 0 6 " > - 
-             < T o o l t i p T e x t   l a n g = " e n - U S " > S p e c i f i e s   t h e   c u s t o m e r ' s   n a m e   t h a t   a p p e a r s   o n   a l l   r e l a t e d   d o c u m e n t s .   F o r   c o m p a n i e s ,   s p e c i f y   t h e   c o m p a n y ' s   n a m e   h e r e ,   a n d   t h e n   a d d   t h e   r e l e v a n t   p e o p l e   a s   c o n t a c t s   t h a t   y o u   l i n k   t o   t h i s   c u s t o m e r . < / T o o l t i p T e x t > - 
-         < / T o o l t i p > - 
-         < T o o l t i p   c o l u m n = " B a l a n c e L C Y "   E l e m e n t I d = " 5 0 0 1 8 9 8 9 9 " > - 
-             < T o o l t i p T e x t   l a n g = " e n - U S " > S p e c i f i e s   t h e   p a y m e n t   a m o u n t   t h a t   t h e   c u s t o m e r   o w e s   f o r   c o m p l e t e d   s a l e s .   T h i s   v a l u e   i s   a l s o   k n o w n   a s   t h e   c u s t o m e r ' s   b a l a n c e . < / T o o l t i p T e x t > - 
-         < / T o o l t i p > - 
-         < T o o l t i p   c o l u m n = " C u s t o m e r P o s t i n g G r o u p "   E l e m e n t I d = " 2 1 1 6 9 0 2 2 1 0 " > - 
-             < T o o l t i p T e x t   l a n g = " e n - U S " > S p e c i f i e s   t h e   c u s t o m e r ' s   m a r k e t   t y p e   t o   l i n k   b u s i n e s s   t r a n s a c t i o n s   t o . < / T o o l t i p T e x t > - 
-         < / T o o l t i p > - 
-         < T o o l t i p   c o l u m n = " C r e d i t L i m i t L C Y "   E l e m e n t I d = " 1 9 2 4 5 2 2 8 5 1 " > - 
-             < T o o l t i p T e x t   l a n g = " e n - U S " > S p e c i f i e s   t h e   m a x i m u m   a m o u n t   o f   c r e d i t   t h a t   y o u   e x t e n d   t o   t h e   c u s t o m e r   f o r   t h e i r   p u r c h a s e s   b e f o r e   y o u   i s s u e   w a r n i n g s .   T h e   v a l u e   0   r e p r e s e n t s   u n l i m i t e d   c r e d i t . < / T o o l t i p T e x t > - 
-         < / T o o l t i p > - 
-     < / T o o l t i p s > - 
-     < C u s t o m e r   E l e m e n t T y p e = " D a t a I t e m "   E l e m e n t I d = " 1 5 2 5 1 9 1 9 9 " > - 
-         < B a l a n c e L C Y   E l e m e n t T y p e = " C o l u m n "   E l e m e n t I d = " 5 0 0 1 8 9 8 9 9 "   D a t a T y p e = " D e c i m a l " > B a l a n c e L C Y < / B a l a n c e L C Y > - 
-         < C r e d i t L i m i t L C Y   E l e m e n t T y p e = " C o l u m n "   E l e m e n t I d = " 1 9 2 4 5 2 2 8 5 1 "   D a t a T y p e = " D e c i m a l " > C r e d i t L i m i t L C Y < / C r e d i t L i m i t L C Y > - 
-         < C u s t o m e r P o s t i n g G r o u p   E l e m e n t T y p e = " C o l u m n "   E l e m e n t I d = " 2 1 1 6 9 0 2 2 1 0 "   D a t a T y p e = " C o d e " > C u s t o m e r P o s t i n g G r o u p < / C u s t o m e r P o s t i n g G r o u p > - 
-         < N a m e   E l e m e n t T y p e = " C o l u m n "   E l e m e n t I d = " 8 1 4 0 6 8 7 0 6 "   D a t a T y p e = " T e x t " > N a m e < / N a m e > - 
-         < N o   E l e m e n t T y p e = " C o l u m n "   E l e m e n t I d = " 1 1 9 8 2 6 8 3 4 0 "   D a t a T y p e = " C o d e " > N o < / N o > +     < C u s t o m e r > + 
+         < B a l a n c e L C Y > B a l a n c e L C Y < / B a l a n c e L C Y > + 
+         < C r e d i t L i m i t L C Y > C r e d i t L i m i t L C Y < / C r e d i t L i m i t L C Y > + 
+         < C u s t o m e r P o s t i n g G r o u p > C u s t o m e r P o s t i n g G r o u p < / C u s t o m e r P o s t i n g G r o u p > + 
+         < N a m e > N a m e < / N a m e > + 
+         < N o > N o < / N o >   
      < / C u s t o m e r >   
  < / N a v W o r d R e p o r t X m l P a r t > 
 </file>
 
-<file path=customXml/item2.xml>��< ? x m l   v e r s i o n = " 1 . 0 "   e n c o d i n g = " u t f - 1 6 " ? > < N a v W o r d R e p o r t X m l P a r t   x m l n s = " u r n : m i c r o s o f t - d y n a m i c s - n a v / r e p o r t s / G o l d _ C u s t o m e r _ R e p o r t / 5 0 1 1 0 / " > +<file path=customXml/item2.xml>��< ? x m l   v e r s i o n = " 1 . 0 "   e n c o d i n g = " u t f - 1 6 " ? > < N a v W o r d R e p o r t X m l P a r t   x m l n s = " u r n : m i c r o s o f t - d y n a m i c s - b u s i n e s s c e n t r a l / i n t e r n a l / e x t e n d e d / r e p o r t s / G o l d _ C u s t o m e r _ R e p o r t / 5 0 1 1 0 / " >   
      < B C R e p o r t I n f o r m a t i o n >   
@@ -1758,17 +1948,51 @@
  
      < / B C R e p o r t I n f o r m a t i o n >   
-     < C u s t o m e r > - 
-         < B a l a n c e L C Y > B a l a n c e L C Y < / B a l a n c e L C Y > - 
-         < C r e d i t L i m i t L C Y > C r e d i t L i m i t L C Y < / C r e d i t L i m i t L C Y > - 
-         < C u s t o m e r P o s t i n g G r o u p > C u s t o m e r P o s t i n g G r o u p < / C u s t o m e r P o s t i n g G r o u p > - 
-         < N a m e > N a m e < / N a m e > - 
-         < N o > N o < / N o > +     < T o o l t i p s > + 
+         < T o o l t i p   c o l u m n = " N o "   E l e m e n t I d = " 1 1 9 8 2 6 8 3 4 0 " > + 
+             < T o o l t i p T e x t   l a n g = " e n - U S " > S p e c i f i e s   t h e   n u m b e r   o f   t h e   c u s t o m e r .   T h e   f i e l d   i s   e i t h e r   f i l l e d   a u t o m a t i c a l l y   f r o m   a   d e f i n e d   n u m b e r   s e r i e s ,   o r   y o u   e n t e r   t h e   n u m b e r   m a n u a l l y   b e c a u s e   y o u   h a v e   e n a b l e d   m a n u a l   n u m b e r   e n t r y   i n   t h e   n u m b e r - s e r i e s   s e t u p . < / T o o l t i p T e x t > + 
+         < / T o o l t i p > + 
+         < T o o l t i p   c o l u m n = " N a m e "   E l e m e n t I d = " 8 1 4 0 6 8 7 0 6 " > + 
+             < T o o l t i p T e x t   l a n g = " e n - U S " > S p e c i f i e s   t h e   c u s t o m e r ' s   n a m e   t h a t   a p p e a r s   o n   a l l   r e l a t e d   d o c u m e n t s .   F o r   c o m p a n i e s ,   s p e c i f y   t h e   c o m p a n y ' s   n a m e   h e r e ,   a n d   t h e n   a d d   t h e   r e l e v a n t   p e o p l e   a s   c o n t a c t s   t h a t   y o u   l i n k   t o   t h i s   c u s t o m e r . < / T o o l t i p T e x t > + 
+         < / T o o l t i p > + 
+         < T o o l t i p   c o l u m n = " B a l a n c e L C Y "   E l e m e n t I d = " 5 0 0 1 8 9 8 9 9 " > + 
+             < T o o l t i p T e x t   l a n g = " e n - U S " > S p e c i f i e s   t h e   p a y m e n t   a m o u n t   t h a t   t h e   c u s t o m e r   o w e s   f o r   c o m p l e t e d   s a l e s .   T h i s   v a l u e   i s   a l s o   k n o w n   a s   t h e   c u s t o m e r ' s   b a l a n c e . < / T o o l t i p T e x t > + 
+         < / T o o l t i p > + 
+         < T o o l t i p   c o l u m n = " C u s t o m e r P o s t i n g G r o u p "   E l e m e n t I d = " 2 1 1 6 9 0 2 2 1 0 " > + 
+             < T o o l t i p T e x t   l a n g = " e n - U S " > S p e c i f i e s   t h e   c u s t o m e r ' s   m a r k e t   t y p e   t o   l i n k   b u s i n e s s   t r a n s a c t i o n s   t o . < / T o o l t i p T e x t > + 
+         < / T o o l t i p > + 
+         < T o o l t i p   c o l u m n = " C r e d i t L i m i t L C Y "   E l e m e n t I d = " 1 9 2 4 5 2 2 8 5 1 " > + 
+             < T o o l t i p T e x t   l a n g = " e n - U S " > S p e c i f i e s   t h e   m a x i m u m   a m o u n t   o f   c r e d i t   t h a t   y o u   e x t e n d   t o   t h e   c u s t o m e r   f o r   t h e i r   p u r c h a s e s   b e f o r e   y o u   i s s u e   w a r n i n g s .   T h e   v a l u e   0   r e p r e s e n t s   u n l i m i t e d   c r e d i t . < / T o o l t i p T e x t > + 
+         < / T o o l t i p > + 
+     < / T o o l t i p s > + 
+     < C u s t o m e r   E l e m e n t T y p e = " D a t a I t e m "   E l e m e n t I d = " 1 5 2 5 1 9 1 9 9 " > + 
+         < B a l a n c e L C Y   E l e m e n t T y p e = " C o l u m n "   E l e m e n t I d = " 5 0 0 1 8 9 8 9 9 "   D a t a T y p e = " D e c i m a l " > B a l a n c e L C Y < / B a l a n c e L C Y > + 
+         < C r e d i t L i m i t L C Y   E l e m e n t T y p e = " C o l u m n "   E l e m e n t I d = " 1 9 2 4 5 2 2 8 5 1 "   D a t a T y p e = " D e c i m a l " > C r e d i t L i m i t L C Y < / C r e d i t L i m i t L C Y > + 
+         < C u s t o m e r P o s t i n g G r o u p   E l e m e n t T y p e = " C o l u m n "   E l e m e n t I d = " 2 1 1 6 9 0 2 2 1 0 "   D a t a T y p e = " C o d e " > C u s t o m e r P o s t i n g G r o u p < / C u s t o m e r P o s t i n g G r o u p > + 
+         < N a m e   E l e m e n t T y p e = " C o l u m n "   E l e m e n t I d = " 8 1 4 0 6 8 7 0 6 "   D a t a T y p e = " T e x t " > N a m e < / N a m e > + 
+         < N o   E l e m e n t T y p e = " C o l u m n "   E l e m e n t I d = " 1 1 9 8 2 6 8 3 4 0 "   D a t a T y p e = " C o d e " > N o < / N o >   
      < / C u s t o m e r >   
@@ -1776,17 +2000,17 @@
 </file>
 
 <file path=customXml/itemProps1.xml><?xml version="1.0" encoding="utf-8"?>
+<ds:datastoreItem xmlns:ds="http://schemas.openxmlformats.org/officeDocument/2006/customXml" ds:itemID="{A6B69A3E-D27D-4DC1-B85E-6A3637EC02EF}">
+  <ds:schemaRefs>
+    <ds:schemaRef ds:uri="urn:microsoft-dynamics-nav/reports/Gold_Customer_Report/50110/"/>
+  </ds:schemaRefs>
+</ds:datastoreItem>
+</file>
+
+<file path=customXml/itemProps2.xml><?xml version="1.0" encoding="utf-8"?>
 <ds:datastoreItem xmlns:ds="http://schemas.openxmlformats.org/officeDocument/2006/customXml" ds:itemID="{91ECF522-4F59-46E9-A54A-AEFF76E14CA1}">
   <ds:schemaRefs>
     <ds:schemaRef ds:uri="urn:microsoft-dynamics-businesscentral/internal/extended/reports/Gold_Customer_Report/50110/"/>
   </ds:schemaRefs>
 </ds:datastoreItem>
-</file>
-
-<file path=customXml/itemProps2.xml><?xml version="1.0" encoding="utf-8"?>
-<ds:datastoreItem xmlns:ds="http://schemas.openxmlformats.org/officeDocument/2006/customXml" ds:itemID="{A6B69A3E-D27D-4DC1-B85E-6A3637EC02EF}">
-  <ds:schemaRefs>
-    <ds:schemaRef ds:uri="urn:microsoft-dynamics-nav/reports/Gold_Customer_Report/50110/"/>
-  </ds:schemaRefs>
-</ds:datastoreItem>
 </file>
</xml_diff>

<commit_message>
W3D5: Add row number column, fix balance filter, test report and export PDF
</commit_message>
<xml_diff>
--- a/GoldCustomerReport.docx
+++ b/GoldCustomerReport.docx
@@ -5,26 +5,31 @@
     <w:tbl>
       <w:tblPr>
         <w:tblStyle w:val="TableGrid"/>
-        <w:tblpPr w:leftFromText="180" w:rightFromText="180" w:vertAnchor="text" w:horzAnchor="margin" w:tblpY="960"/>
-        <w:tblW w:w="0" w:type="auto"/>
+        <w:tblpPr w:leftFromText="180" w:rightFromText="180" w:vertAnchor="text" w:horzAnchor="margin" w:tblpY="70"/>
+        <w:tblW w:w="10138" w:type="dxa"/>
         <w:tblLayout w:type="fixed"/>
         <w:tblLook w:val="04A0" w:firstRow="1" w:lastRow="0" w:firstColumn="1" w:lastColumn="0" w:noHBand="0" w:noVBand="1"/>
       </w:tblPr>
       <w:tblGrid>
-        <w:gridCol w:w="1440"/>
-        <w:gridCol w:w="3168"/>
-        <w:gridCol w:w="1728"/>
-        <w:gridCol w:w="2016"/>
-        <w:gridCol w:w="1728"/>
+        <w:gridCol w:w="724"/>
+        <w:gridCol w:w="1303"/>
+        <w:gridCol w:w="2897"/>
+        <w:gridCol w:w="1738"/>
+        <w:gridCol w:w="1883"/>
+        <w:gridCol w:w="1593"/>
       </w:tblGrid>
       <w:tr>
+        <w:trPr>
+          <w:trHeight w:val="576"/>
+        </w:trPr>
         <w:tc>
           <w:tcPr>
-            <w:tcW w:w="1440" w:type="dxa"/>
+            <w:tcW w:w="724" w:type="dxa"/>
             <w:shd w:val="clear" w:color="auto" w:fill="153D63" w:themeFill="text2" w:themeFillTint="E6"/>
           </w:tcPr>
           <w:p>
             <w:pPr>
+              <w:jc w:val="center"/>
               <w:rPr>
                 <w:b/>
                 <w:bCs/>
@@ -43,11 +48,44 @@
         </w:tc>
         <w:tc>
           <w:tcPr>
-            <w:tcW w:w="3168" w:type="dxa"/>
+            <w:tcW w:w="1303" w:type="dxa"/>
             <w:shd w:val="clear" w:color="auto" w:fill="153D63" w:themeFill="text2" w:themeFillTint="E6"/>
           </w:tcPr>
           <w:p>
             <w:pPr>
+              <w:jc w:val="center"/>
+              <w:rPr>
+                <w:b/>
+                <w:bCs/>
+                <w:color w:val="FFFFFF" w:themeColor="background1"/>
+              </w:rPr>
+            </w:pPr>
+            <w:r>
+              <w:rPr>
+                <w:b/>
+                <w:bCs/>
+                <w:color w:val="FFFFFF" w:themeColor="background1"/>
+              </w:rPr>
+              <w:t xml:space="preserve">Cust. </w:t>
+            </w:r>
+            <w:r>
+              <w:rPr>
+                <w:b/>
+                <w:bCs/>
+                <w:color w:val="FFFFFF" w:themeColor="background1"/>
+              </w:rPr>
+              <w:t>No.</w:t>
+            </w:r>
+          </w:p>
+        </w:tc>
+        <w:tc>
+          <w:tcPr>
+            <w:tcW w:w="2897" w:type="dxa"/>
+            <w:shd w:val="clear" w:color="auto" w:fill="153D63" w:themeFill="text2" w:themeFillTint="E6"/>
+          </w:tcPr>
+          <w:p>
+            <w:pPr>
+              <w:jc w:val="center"/>
               <w:rPr>
                 <w:b/>
                 <w:bCs/>
@@ -66,11 +104,12 @@
         </w:tc>
         <w:tc>
           <w:tcPr>
-            <w:tcW w:w="1728" w:type="dxa"/>
+            <w:tcW w:w="1738" w:type="dxa"/>
             <w:shd w:val="clear" w:color="auto" w:fill="153D63" w:themeFill="text2" w:themeFillTint="E6"/>
           </w:tcPr>
           <w:p>
             <w:pPr>
+              <w:jc w:val="center"/>
               <w:rPr>
                 <w:b/>
                 <w:bCs/>
@@ -89,11 +128,12 @@
         </w:tc>
         <w:tc>
           <w:tcPr>
-            <w:tcW w:w="2016" w:type="dxa"/>
+            <w:tcW w:w="1883" w:type="dxa"/>
             <w:shd w:val="clear" w:color="auto" w:fill="153D63" w:themeFill="text2" w:themeFillTint="E6"/>
           </w:tcPr>
           <w:p>
             <w:pPr>
+              <w:jc w:val="center"/>
               <w:rPr>
                 <w:b/>
                 <w:bCs/>
@@ -112,11 +152,12 @@
         </w:tc>
         <w:tc>
           <w:tcPr>
-            <w:tcW w:w="1728" w:type="dxa"/>
+            <w:tcW w:w="1593" w:type="dxa"/>
             <w:shd w:val="clear" w:color="auto" w:fill="153D63" w:themeFill="text2" w:themeFillTint="E6"/>
           </w:tcPr>
           <w:p>
             <w:pPr>
+              <w:jc w:val="center"/>
               <w:rPr>
                 <w:b/>
                 <w:bCs/>
@@ -157,12 +198,58 @@
               </w:rPr>
               <w:id w:val="1631675663"/>
               <w:placeholder>
-                <w:docPart w:val="5E166907CAC349688074792E2E979A0F"/>
+                <w:docPart w:val="965D5AC2E410419ABE27C128B3BC2B2B"/>
               </w:placeholder>
               <w15:repeatingSectionItem/>
             </w:sdtPr>
             <w:sdtContent>
               <w:tr>
+                <w:trPr>
+                  <w:trHeight w:val="485"/>
+                </w:trPr>
+                <w:sdt>
+                  <w:sdtPr>
+                    <w:rPr>
+                      <w:rFonts w:ascii="Arial" w:hAnsi="Arial" w:cs="Arial"/>
+                      <w:sz w:val="22"/>
+                      <w:szCs w:val="22"/>
+                    </w:rPr>
+                    <w:alias w:val="#Nav: /Customer/RowNo"/>
+                    <w:tag w:val="#Nav: Gold_Customer_Report/50110"/>
+                    <w:id w:val="1789163689"/>
+                    <w:placeholder>
+                      <w:docPart w:val="7D1CDCF3D94C480593674BA44C88DABC"/>
+                    </w:placeholder>
+                    <w:dataBinding w:prefixMappings="xmlns:ns0='urn:microsoft-dynamics-nav/reports/Gold_Customer_Report/50110/' " w:xpath="/ns0:NavWordReportXmlPart[1]/ns0:Customer[1]/ns0:RowNo[1]" w:storeItemID="{A6B69A3E-D27D-4DC1-B85E-6A3637EC02EF}"/>
+                    <w:text/>
+                  </w:sdtPr>
+                  <w:sdtContent>
+                    <w:tc>
+                      <w:tcPr>
+                        <w:tcW w:w="724" w:type="dxa"/>
+                      </w:tcPr>
+                      <w:p>
+                        <w:pPr>
+                          <w:rPr>
+                            <w:rFonts w:ascii="Arial" w:hAnsi="Arial" w:cs="Arial"/>
+                            <w:sz w:val="22"/>
+                            <w:szCs w:val="22"/>
+                          </w:rPr>
+                        </w:pPr>
+                        <w:proofErr w:type="spellStart"/>
+                        <w:r>
+                          <w:rPr>
+                            <w:rFonts w:ascii="Arial" w:hAnsi="Arial" w:cs="Arial"/>
+                            <w:sz w:val="22"/>
+                            <w:szCs w:val="22"/>
+                          </w:rPr>
+                          <w:t>RowNo</w:t>
+                        </w:r>
+                        <w:proofErr w:type="spellEnd"/>
+                      </w:p>
+                    </w:tc>
+                  </w:sdtContent>
+                </w:sdt>
                 <w:sdt>
                   <w:sdtPr>
                     <w:rPr>
@@ -174,7 +261,7 @@
                     <w:tag w:val="#Nav: Gold_Customer_Report/50110"/>
                     <w:id w:val="-2131615398"/>
                     <w:placeholder>
-                      <w:docPart w:val="B0DFB5D9C73D4792BAC1FB4BB8F56E61"/>
+                      <w:docPart w:val="F547F88D76CC462EBE3382785AD47080"/>
                     </w:placeholder>
                     <w:dataBinding w:prefixMappings="xmlns:ns0='urn:microsoft-dynamics-nav/reports/Gold_Customer_Report/50110/' " w:xpath="/ns0:NavWordReportXmlPart[1]/ns0:Customer[1]/ns0:No[1]" w:storeItemID="{A6B69A3E-D27D-4DC1-B85E-6A3637EC02EF}"/>
                     <w:text/>
@@ -182,7 +269,7 @@
                   <w:sdtContent>
                     <w:tc>
                       <w:tcPr>
-                        <w:tcW w:w="1440" w:type="dxa"/>
+                        <w:tcW w:w="1303" w:type="dxa"/>
                       </w:tcPr>
                       <w:p>
                         <w:pPr>
@@ -215,7 +302,7 @@
                     <w:tag w:val="#Nav: Gold_Customer_Report/50110"/>
                     <w:id w:val="462541952"/>
                     <w:placeholder>
-                      <w:docPart w:val="B0DFB5D9C73D4792BAC1FB4BB8F56E61"/>
+                      <w:docPart w:val="F547F88D76CC462EBE3382785AD47080"/>
                     </w:placeholder>
                     <w:dataBinding w:prefixMappings="xmlns:ns0='urn:microsoft-dynamics-nav/reports/Gold_Customer_Report/50110/' " w:xpath="/ns0:NavWordReportXmlPart[1]/ns0:Customer[1]/ns0:Name[1]" w:storeItemID="{A6B69A3E-D27D-4DC1-B85E-6A3637EC02EF}"/>
                     <w:text/>
@@ -223,7 +310,7 @@
                   <w:sdtContent>
                     <w:tc>
                       <w:tcPr>
-                        <w:tcW w:w="3168" w:type="dxa"/>
+                        <w:tcW w:w="2897" w:type="dxa"/>
                       </w:tcPr>
                       <w:p>
                         <w:pPr>
@@ -256,7 +343,7 @@
                     <w:tag w:val="#Nav: Gold_Customer_Report/50110"/>
                     <w:id w:val="-2139326276"/>
                     <w:placeholder>
-                      <w:docPart w:val="B0DFB5D9C73D4792BAC1FB4BB8F56E61"/>
+                      <w:docPart w:val="F547F88D76CC462EBE3382785AD47080"/>
                     </w:placeholder>
                     <w:dataBinding w:prefixMappings="xmlns:ns0='urn:microsoft-dynamics-nav/reports/Gold_Customer_Report/50110/' " w:xpath="/ns0:NavWordReportXmlPart[1]/ns0:Customer[1]/ns0:BalanceLCY[1]" w:storeItemID="{A6B69A3E-D27D-4DC1-B85E-6A3637EC02EF}"/>
                     <w:text/>
@@ -264,7 +351,7 @@
                   <w:sdtContent>
                     <w:tc>
                       <w:tcPr>
-                        <w:tcW w:w="1728" w:type="dxa"/>
+                        <w:tcW w:w="1738" w:type="dxa"/>
                       </w:tcPr>
                       <w:p>
                         <w:pPr>
@@ -299,7 +386,7 @@
                     <w:tag w:val="#Nav: Gold_Customer_Report/50110"/>
                     <w:id w:val="2069531344"/>
                     <w:placeholder>
-                      <w:docPart w:val="B0DFB5D9C73D4792BAC1FB4BB8F56E61"/>
+                      <w:docPart w:val="F547F88D76CC462EBE3382785AD47080"/>
                     </w:placeholder>
                     <w:dataBinding w:prefixMappings="xmlns:ns0='urn:microsoft-dynamics-nav/reports/Gold_Customer_Report/50110/' " w:xpath="/ns0:NavWordReportXmlPart[1]/ns0:Customer[1]/ns0:CustomerPostingGroup[1]" w:storeItemID="{A6B69A3E-D27D-4DC1-B85E-6A3637EC02EF}"/>
                     <w:text/>
@@ -307,7 +394,7 @@
                   <w:sdtContent>
                     <w:tc>
                       <w:tcPr>
-                        <w:tcW w:w="2016" w:type="dxa"/>
+                        <w:tcW w:w="1883" w:type="dxa"/>
                       </w:tcPr>
                       <w:p>
                         <w:pPr>
@@ -342,7 +429,7 @@
                     <w:tag w:val="#Nav: Gold_Customer_Report/50110"/>
                     <w:id w:val="-1478912556"/>
                     <w:placeholder>
-                      <w:docPart w:val="B0DFB5D9C73D4792BAC1FB4BB8F56E61"/>
+                      <w:docPart w:val="F547F88D76CC462EBE3382785AD47080"/>
                     </w:placeholder>
                     <w:dataBinding w:prefixMappings="xmlns:ns0='urn:microsoft-dynamics-nav/reports/Gold_Customer_Report/50110/' " w:xpath="/ns0:NavWordReportXmlPart[1]/ns0:Customer[1]/ns0:CreditLimitLCY[1]" w:storeItemID="{A6B69A3E-D27D-4DC1-B85E-6A3637EC02EF}"/>
                     <w:text/>
@@ -350,7 +437,7 @@
                   <w:sdtContent>
                     <w:tc>
                       <w:tcPr>
-                        <w:tcW w:w="1728" w:type="dxa"/>
+                        <w:tcW w:w="1593" w:type="dxa"/>
                       </w:tcPr>
                       <w:p>
                         <w:pPr>
@@ -390,15 +477,6 @@
           <w:szCs w:val="32"/>
         </w:rPr>
       </w:pPr>
-      <w:r>
-        <w:rPr>
-          <w:b/>
-          <w:bCs/>
-          <w:sz w:val="32"/>
-          <w:szCs w:val="32"/>
-        </w:rPr>
-        <w:t>Gold Customer Report</w:t>
-      </w:r>
     </w:p>
     <w:p>
       <w:pPr>
@@ -412,6 +490,7 @@
       </w:pPr>
     </w:p>
     <w:sectPr>
+      <w:headerReference w:type="default" r:id="rId8"/>
       <w:pgSz w:w="11906" w:h="16838"/>
       <w:pgMar w:top="1701" w:right="1134" w:bottom="1701" w:left="1134" w:header="708" w:footer="708" w:gutter="0"/>
       <w:cols w:space="708"/>
@@ -419,6 +498,76 @@
     </w:sectPr>
   </w:body>
 </w:document>
+</file>
+
+<file path=word/endnotes.xml><?xml version="1.0" encoding="utf-8"?>
+<w:endnotes xmlns:wpc="http://schemas.microsoft.com/office/word/2010/wordprocessingCanvas" xmlns:cx="http://schemas.microsoft.com/office/drawing/2014/chartex" xmlns:cx1="http://schemas.microsoft.com/office/drawing/2015/9/8/chartex" xmlns:cx2="http://schemas.microsoft.com/office/drawing/2015/10/21/chartex" xmlns:cx3="http://schemas.microsoft.com/office/drawing/2016/5/9/chartex" xmlns:cx4="http://schemas.microsoft.com/office/drawing/2016/5/10/chartex" xmlns:cx5="http://schemas.microsoft.com/office/drawing/2016/5/11/chartex" xmlns:cx6="http://schemas.microsoft.com/office/drawing/2016/5/12/chartex" xmlns:cx7="http://schemas.microsoft.com/office/drawing/2016/5/13/chartex" xmlns:cx8="http://schemas.microsoft.com/office/drawing/2016/5/14/chartex" xmlns:mc="http://schemas.openxmlformats.org/markup-compatibility/2006" xmlns:aink="http://schemas.microsoft.com/office/drawing/2016/ink" xmlns:am3d="http://schemas.microsoft.com/office/drawing/2017/model3d" xmlns:o="urn:schemas-microsoft-com:office:office" xmlns:oel="http://schemas.microsoft.com/office/2019/extlst" xmlns:r="http://schemas.openxmlformats.org/officeDocument/2006/relationships" xmlns:m="http://schemas.openxmlformats.org/officeDocument/2006/math" xmlns:v="urn:schemas-microsoft-com:vml" xmlns:wp14="http://schemas.microsoft.com/office/word/2010/wordprocessingDrawing" xmlns:wp="http://schemas.openxmlformats.org/drawingml/2006/wordprocessingDrawing" xmlns:w10="urn:schemas-microsoft-com:office:word" xmlns:w="http://schemas.openxmlformats.org/wordprocessingml/2006/main" xmlns:w14="http://schemas.microsoft.com/office/word/2010/wordml" xmlns:w15="http://schemas.microsoft.com/office/word/2012/wordml" xmlns:w16cex="http://schemas.microsoft.com/office/word/2018/wordml/cex" xmlns:w16cid="http://schemas.microsoft.com/office/word/2016/wordml/cid" xmlns:w16="http://schemas.microsoft.com/office/word/2018/wordml" xmlns:w16du="http://schemas.microsoft.com/office/word/2023/wordml/word16du" xmlns:w16sdtdh="http://schemas.microsoft.com/office/word/2020/wordml/sdtdatahash" xmlns:w16sdtfl="http://schemas.microsoft.com/office/word/2024/wordml/sdtformatlock" xmlns:w16se="http://schemas.microsoft.com/office/word/2015/wordml/symex" xmlns:wpg="http://schemas.microsoft.com/office/word/2010/wordprocessingGroup" xmlns:wpi="http://schemas.microsoft.com/office/word/2010/wordprocessingInk" xmlns:wne="http://schemas.microsoft.com/office/word/2006/wordml" xmlns:wps="http://schemas.microsoft.com/office/word/2010/wordprocessingShape" mc:Ignorable="w14 w15 w16se w16cid w16 w16cex w16sdtdh w16sdtfl w16du wp14">
+  <w:endnote w:type="separator" w:id="-1">
+    <w:p>
+      <w:pPr>
+        <w:spacing w:after="0" w:line="240" w:lineRule="auto"/>
+      </w:pPr>
+      <w:r>
+        <w:separator/>
+      </w:r>
+    </w:p>
+  </w:endnote>
+  <w:endnote w:type="continuationSeparator" w:id="0">
+    <w:p>
+      <w:pPr>
+        <w:spacing w:after="0" w:line="240" w:lineRule="auto"/>
+      </w:pPr>
+      <w:r>
+        <w:continuationSeparator/>
+      </w:r>
+    </w:p>
+  </w:endnote>
+</w:endnotes>
+</file>
+
+<file path=word/footnotes.xml><?xml version="1.0" encoding="utf-8"?>
+<w:footnotes xmlns:wpc="http://schemas.microsoft.com/office/word/2010/wordprocessingCanvas" xmlns:cx="http://schemas.microsoft.com/office/drawing/2014/chartex" xmlns:cx1="http://schemas.microsoft.com/office/drawing/2015/9/8/chartex" xmlns:cx2="http://schemas.microsoft.com/office/drawing/2015/10/21/chartex" xmlns:cx3="http://schemas.microsoft.com/office/drawing/2016/5/9/chartex" xmlns:cx4="http://schemas.microsoft.com/office/drawing/2016/5/10/chartex" xmlns:cx5="http://schemas.microsoft.com/office/drawing/2016/5/11/chartex" xmlns:cx6="http://schemas.microsoft.com/office/drawing/2016/5/12/chartex" xmlns:cx7="http://schemas.microsoft.com/office/drawing/2016/5/13/chartex" xmlns:cx8="http://schemas.microsoft.com/office/drawing/2016/5/14/chartex" xmlns:mc="http://schemas.openxmlformats.org/markup-compatibility/2006" xmlns:aink="http://schemas.microsoft.com/office/drawing/2016/ink" xmlns:am3d="http://schemas.microsoft.com/office/drawing/2017/model3d" xmlns:o="urn:schemas-microsoft-com:office:office" xmlns:oel="http://schemas.microsoft.com/office/2019/extlst" xmlns:r="http://schemas.openxmlformats.org/officeDocument/2006/relationships" xmlns:m="http://schemas.openxmlformats.org/officeDocument/2006/math" xmlns:v="urn:schemas-microsoft-com:vml" xmlns:wp14="http://schemas.microsoft.com/office/word/2010/wordprocessingDrawing" xmlns:wp="http://schemas.openxmlformats.org/drawingml/2006/wordprocessingDrawing" xmlns:w10="urn:schemas-microsoft-com:office:word" xmlns:w="http://schemas.openxmlformats.org/wordprocessingml/2006/main" xmlns:w14="http://schemas.microsoft.com/office/word/2010/wordml" xmlns:w15="http://schemas.microsoft.com/office/word/2012/wordml" xmlns:w16cex="http://schemas.microsoft.com/office/word/2018/wordml/cex" xmlns:w16cid="http://schemas.microsoft.com/office/word/2016/wordml/cid" xmlns:w16="http://schemas.microsoft.com/office/word/2018/wordml" xmlns:w16du="http://schemas.microsoft.com/office/word/2023/wordml/word16du" xmlns:w16sdtdh="http://schemas.microsoft.com/office/word/2020/wordml/sdtdatahash" xmlns:w16sdtfl="http://schemas.microsoft.com/office/word/2024/wordml/sdtformatlock" xmlns:w16se="http://schemas.microsoft.com/office/word/2015/wordml/symex" xmlns:wpg="http://schemas.microsoft.com/office/word/2010/wordprocessingGroup" xmlns:wpi="http://schemas.microsoft.com/office/word/2010/wordprocessingInk" xmlns:wne="http://schemas.microsoft.com/office/word/2006/wordml" xmlns:wps="http://schemas.microsoft.com/office/word/2010/wordprocessingShape" mc:Ignorable="w14 w15 w16se w16cid w16 w16cex w16sdtdh w16sdtfl w16du wp14">
+  <w:footnote w:type="separator" w:id="-1">
+    <w:p>
+      <w:pPr>
+        <w:spacing w:after="0" w:line="240" w:lineRule="auto"/>
+      </w:pPr>
+      <w:r>
+        <w:separator/>
+      </w:r>
+    </w:p>
+  </w:footnote>
+  <w:footnote w:type="continuationSeparator" w:id="0">
+    <w:p>
+      <w:pPr>
+        <w:spacing w:after="0" w:line="240" w:lineRule="auto"/>
+      </w:pPr>
+      <w:r>
+        <w:continuationSeparator/>
+      </w:r>
+    </w:p>
+  </w:footnote>
+</w:footnotes>
+</file>
+
+<file path=word/header1.xml><?xml version="1.0" encoding="utf-8"?>
+<w:hdr xmlns:wpc="http://schemas.microsoft.com/office/word/2010/wordprocessingCanvas" xmlns:cx="http://schemas.microsoft.com/office/drawing/2014/chartex" xmlns:cx1="http://schemas.microsoft.com/office/drawing/2015/9/8/chartex" xmlns:cx2="http://schemas.microsoft.com/office/drawing/2015/10/21/chartex" xmlns:cx3="http://schemas.microsoft.com/office/drawing/2016/5/9/chartex" xmlns:cx4="http://schemas.microsoft.com/office/drawing/2016/5/10/chartex" xmlns:cx5="http://schemas.microsoft.com/office/drawing/2016/5/11/chartex" xmlns:cx6="http://schemas.microsoft.com/office/drawing/2016/5/12/chartex" xmlns:cx7="http://schemas.microsoft.com/office/drawing/2016/5/13/chartex" xmlns:cx8="http://schemas.microsoft.com/office/drawing/2016/5/14/chartex" xmlns:mc="http://schemas.openxmlformats.org/markup-compatibility/2006" xmlns:aink="http://schemas.microsoft.com/office/drawing/2016/ink" xmlns:am3d="http://schemas.microsoft.com/office/drawing/2017/model3d" xmlns:o="urn:schemas-microsoft-com:office:office" xmlns:oel="http://schemas.microsoft.com/office/2019/extlst" xmlns:r="http://schemas.openxmlformats.org/officeDocument/2006/relationships" xmlns:m="http://schemas.openxmlformats.org/officeDocument/2006/math" xmlns:v="urn:schemas-microsoft-com:vml" xmlns:wp14="http://schemas.microsoft.com/office/word/2010/wordprocessingDrawing" xmlns:wp="http://schemas.openxmlformats.org/drawingml/2006/wordprocessingDrawing" xmlns:w10="urn:schemas-microsoft-com:office:word" xmlns:w="http://schemas.openxmlformats.org/wordprocessingml/2006/main" xmlns:w14="http://schemas.microsoft.com/office/word/2010/wordml" xmlns:w15="http://schemas.microsoft.com/office/word/2012/wordml" xmlns:w16cex="http://schemas.microsoft.com/office/word/2018/wordml/cex" xmlns:w16cid="http://schemas.microsoft.com/office/word/2016/wordml/cid" xmlns:w16="http://schemas.microsoft.com/office/word/2018/wordml" xmlns:w16du="http://schemas.microsoft.com/office/word/2023/wordml/word16du" xmlns:w16sdtdh="http://schemas.microsoft.com/office/word/2020/wordml/sdtdatahash" xmlns:w16sdtfl="http://schemas.microsoft.com/office/word/2024/wordml/sdtformatlock" xmlns:w16se="http://schemas.microsoft.com/office/word/2015/wordml/symex" xmlns:wpg="http://schemas.microsoft.com/office/word/2010/wordprocessingGroup" xmlns:wpi="http://schemas.microsoft.com/office/word/2010/wordprocessingInk" xmlns:wne="http://schemas.microsoft.com/office/word/2006/wordml" xmlns:wps="http://schemas.microsoft.com/office/word/2010/wordprocessingShape" mc:Ignorable="w14 w15 w16se w16cid w16 w16cex w16sdtdh w16sdtfl w16du wp14">
+  <w:p>
+    <w:pPr>
+      <w:pStyle w:val="Header"/>
+      <w:jc w:val="center"/>
+    </w:pPr>
+    <w:r>
+      <w:rPr>
+        <w:b/>
+        <w:bCs/>
+        <w:sz w:val="32"/>
+        <w:szCs w:val="32"/>
+      </w:rPr>
+      <w:t>Gold Customer Report</w:t>
+    </w:r>
+  </w:p>
+</w:hdr>
 </file>
 
 <file path=word/styles.xml><?xml version="1.0" encoding="utf-8"?>
@@ -825,6 +974,7 @@
   <w:style w:type="character" w:default="1" w:styleId="DefaultParagraphFont">
     <w:name w:val="Default Paragraph Font"/>
     <w:uiPriority w:val="1"/>
+    <w:semiHidden/>
     <w:unhideWhenUsed/>
   </w:style>
   <w:style w:type="table" w:default="1" w:styleId="TableNormal">
@@ -877,6 +1027,50 @@
       <w:color w:val="666666"/>
     </w:rPr>
   </w:style>
+  <w:style w:type="paragraph" w:styleId="Header">
+    <w:name w:val="header"/>
+    <w:basedOn w:val="Normal"/>
+    <w:link w:val="HeaderChar"/>
+    <w:uiPriority w:val="99"/>
+    <w:unhideWhenUsed/>
+    <w:rsid w:val="00373790"/>
+    <w:pPr>
+      <w:tabs>
+        <w:tab w:val="center" w:pos="4680"/>
+        <w:tab w:val="right" w:pos="9360"/>
+      </w:tabs>
+      <w:spacing w:after="0" w:line="240" w:lineRule="auto"/>
+    </w:pPr>
+  </w:style>
+  <w:style w:type="character" w:customStyle="1" w:styleId="HeaderChar">
+    <w:name w:val="Header Char"/>
+    <w:basedOn w:val="DefaultParagraphFont"/>
+    <w:link w:val="Header"/>
+    <w:uiPriority w:val="99"/>
+    <w:rsid w:val="00373790"/>
+  </w:style>
+  <w:style w:type="paragraph" w:styleId="Footer">
+    <w:name w:val="footer"/>
+    <w:basedOn w:val="Normal"/>
+    <w:link w:val="FooterChar"/>
+    <w:uiPriority w:val="99"/>
+    <w:unhideWhenUsed/>
+    <w:rsid w:val="00373790"/>
+    <w:pPr>
+      <w:tabs>
+        <w:tab w:val="center" w:pos="4680"/>
+        <w:tab w:val="right" w:pos="9360"/>
+      </w:tabs>
+      <w:spacing w:after="0" w:line="240" w:lineRule="auto"/>
+    </w:pPr>
+  </w:style>
+  <w:style w:type="character" w:customStyle="1" w:styleId="FooterChar">
+    <w:name w:val="Footer Char"/>
+    <w:basedOn w:val="DefaultParagraphFont"/>
+    <w:link w:val="Footer"/>
+    <w:uiPriority w:val="99"/>
+    <w:rsid w:val="00373790"/>
+  </w:style>
 </w:styles>
 </file>
 
@@ -885,7 +1079,7 @@
   <w:docParts>
     <w:docPart>
       <w:docPartPr>
-        <w:name w:val="5E166907CAC349688074792E2E979A0F"/>
+        <w:name w:val="965D5AC2E410419ABE27C128B3BC2B2B"/>
         <w:category>
           <w:name w:val="General"/>
           <w:gallery w:val="placeholder"/>
@@ -896,12 +1090,12 @@
         <w:behaviors>
           <w:behavior w:val="content"/>
         </w:behaviors>
-        <w:guid w:val="{22FFABD2-C1E6-4E24-942D-D92736059C31}"/>
+        <w:guid w:val="{4ACFCB96-7E2B-431A-BF0D-CDA46DAF4EA0}"/>
       </w:docPartPr>
       <w:docPartBody>
         <w:p>
           <w:pPr>
-            <w:pStyle w:val="5E166907CAC349688074792E2E979A0F"/>
+            <w:pStyle w:val="965D5AC2E410419ABE27C128B3BC2B2B"/>
           </w:pPr>
           <w:r>
             <w:rPr>
@@ -914,7 +1108,7 @@
     </w:docPart>
     <w:docPart>
       <w:docPartPr>
-        <w:name w:val="B0DFB5D9C73D4792BAC1FB4BB8F56E61"/>
+        <w:name w:val="7D1CDCF3D94C480593674BA44C88DABC"/>
         <w:category>
           <w:name w:val="General"/>
           <w:gallery w:val="placeholder"/>
@@ -925,12 +1119,41 @@
         <w:behaviors>
           <w:behavior w:val="content"/>
         </w:behaviors>
-        <w:guid w:val="{3CFFD12A-B90E-4EE4-A0FD-829EB893160F}"/>
+        <w:guid w:val="{43E6D8F9-CEFE-4687-B7C1-3B599F387925}"/>
       </w:docPartPr>
       <w:docPartBody>
         <w:p>
           <w:pPr>
-            <w:pStyle w:val="B0DFB5D9C73D4792BAC1FB4BB8F56E61"/>
+            <w:pStyle w:val="7D1CDCF3D94C480593674BA44C88DABC"/>
+          </w:pPr>
+          <w:r>
+            <w:rPr>
+              <w:rStyle w:val="PlaceholderText"/>
+            </w:rPr>
+            <w:t>Click or tap here to enter text.</w:t>
+          </w:r>
+        </w:p>
+      </w:docPartBody>
+    </w:docPart>
+    <w:docPart>
+      <w:docPartPr>
+        <w:name w:val="F547F88D76CC462EBE3382785AD47080"/>
+        <w:category>
+          <w:name w:val="General"/>
+          <w:gallery w:val="placeholder"/>
+        </w:category>
+        <w:types>
+          <w:type w:val="bbPlcHdr"/>
+        </w:types>
+        <w:behaviors>
+          <w:behavior w:val="content"/>
+        </w:behaviors>
+        <w:guid w:val="{94026296-7C1A-4BF6-AA99-35D48EC98521}"/>
+      </w:docPartPr>
+      <w:docPartBody>
+        <w:p>
+          <w:pPr>
+            <w:pStyle w:val="F547F88D76CC462EBE3382785AD47080"/>
           </w:pPr>
           <w:r>
             <w:rPr>
@@ -996,8 +1219,17 @@
     <w:rsid w:val="00127CFC"/>
     <w:rsid w:val="004E7393"/>
     <w:rsid w:val="00537A77"/>
+    <w:rsid w:val="00571490"/>
+    <w:rsid w:val="00583D57"/>
+    <w:rsid w:val="005C3479"/>
+    <w:rsid w:val="0068251D"/>
+    <w:rsid w:val="00721BA6"/>
+    <w:rsid w:val="00B40D94"/>
+    <w:rsid w:val="00D32380"/>
     <w:rsid w:val="00DD636D"/>
+    <w:rsid w:val="00DF33C4"/>
     <w:rsid w:val="00E4714B"/>
+    <w:rsid w:val="00E713A8"/>
   </w:rsids>
   <m:mathPr>
     <m:mathFont m:val="Cambria Math"/>
@@ -1453,26 +1685,138 @@
     <w:basedOn w:val="DefaultParagraphFont"/>
     <w:uiPriority w:val="99"/>
     <w:semiHidden/>
-    <w:rsid w:val="00537A77"/>
+    <w:rsid w:val="00571490"/>
     <w:rPr>
       <w:color w:val="666666"/>
     </w:rPr>
   </w:style>
-  <w:style w:type="paragraph" w:customStyle="1" w:styleId="8823329B4D684469ADC40A257F932253">
-    <w:name w:val="8823329B4D684469ADC40A257F932253"/>
-    <w:rsid w:val="00537A77"/>
-  </w:style>
-  <w:style w:type="paragraph" w:customStyle="1" w:styleId="63EC00A0A8F74AFDB23A01A15B1B0F0D">
-    <w:name w:val="63EC00A0A8F74AFDB23A01A15B1B0F0D"/>
-    <w:rsid w:val="00537A77"/>
-  </w:style>
-  <w:style w:type="paragraph" w:customStyle="1" w:styleId="5E166907CAC349688074792E2E979A0F">
-    <w:name w:val="5E166907CAC349688074792E2E979A0F"/>
-    <w:rsid w:val="00537A77"/>
-  </w:style>
-  <w:style w:type="paragraph" w:customStyle="1" w:styleId="B0DFB5D9C73D4792BAC1FB4BB8F56E61">
-    <w:name w:val="B0DFB5D9C73D4792BAC1FB4BB8F56E61"/>
-    <w:rsid w:val="00537A77"/>
+  <w:style w:type="paragraph" w:customStyle="1" w:styleId="137737A0184F4532B0F9EC325A911847">
+    <w:name w:val="137737A0184F4532B0F9EC325A911847"/>
+    <w:rsid w:val="00D32380"/>
+  </w:style>
+  <w:style w:type="paragraph" w:customStyle="1" w:styleId="BB9B0807FBD041FEB120B0BA12AABCE6">
+    <w:name w:val="BB9B0807FBD041FEB120B0BA12AABCE6"/>
+    <w:rsid w:val="00D32380"/>
+  </w:style>
+  <w:style w:type="paragraph" w:customStyle="1" w:styleId="7EB3D0DF2E9843D9A0B2DCB36B4779A2">
+    <w:name w:val="7EB3D0DF2E9843D9A0B2DCB36B4779A2"/>
+    <w:rsid w:val="00571490"/>
+  </w:style>
+  <w:style w:type="paragraph" w:customStyle="1" w:styleId="687C77BC91B54ECDA0462EBF001E4053">
+    <w:name w:val="687C77BC91B54ECDA0462EBF001E4053"/>
+    <w:rsid w:val="00571490"/>
+  </w:style>
+  <w:style w:type="paragraph" w:customStyle="1" w:styleId="4B8EC253127F4CBABB40FE86289D9496">
+    <w:name w:val="4B8EC253127F4CBABB40FE86289D9496"/>
+    <w:rsid w:val="00571490"/>
+  </w:style>
+  <w:style w:type="paragraph" w:customStyle="1" w:styleId="3ABB960D00AA41D0B6BAECFD3242F21E">
+    <w:name w:val="3ABB960D00AA41D0B6BAECFD3242F21E"/>
+    <w:rsid w:val="00571490"/>
+  </w:style>
+  <w:style w:type="paragraph" w:customStyle="1" w:styleId="68B366ABCF4A42C88CBEF0AA3A75F25A">
+    <w:name w:val="68B366ABCF4A42C88CBEF0AA3A75F25A"/>
+    <w:rsid w:val="00571490"/>
+  </w:style>
+  <w:style w:type="paragraph" w:customStyle="1" w:styleId="C724AF9755714908BF90128583602901">
+    <w:name w:val="C724AF9755714908BF90128583602901"/>
+    <w:rsid w:val="00571490"/>
+  </w:style>
+  <w:style w:type="paragraph" w:customStyle="1" w:styleId="A91A7212B9854251A3812081CF29931C">
+    <w:name w:val="A91A7212B9854251A3812081CF29931C"/>
+    <w:rsid w:val="00571490"/>
+  </w:style>
+  <w:style w:type="paragraph" w:customStyle="1" w:styleId="691D6FC04ED4410DB697777465271113">
+    <w:name w:val="691D6FC04ED4410DB697777465271113"/>
+    <w:rsid w:val="00571490"/>
+  </w:style>
+  <w:style w:type="paragraph" w:customStyle="1" w:styleId="E1530A3596A940898B4D3CC58B23F1BB">
+    <w:name w:val="E1530A3596A940898B4D3CC58B23F1BB"/>
+    <w:rsid w:val="00571490"/>
+  </w:style>
+  <w:style w:type="paragraph" w:customStyle="1" w:styleId="4B0E6553278440D3B4F6066C6A3002FE">
+    <w:name w:val="4B0E6553278440D3B4F6066C6A3002FE"/>
+    <w:rsid w:val="00571490"/>
+  </w:style>
+  <w:style w:type="paragraph" w:customStyle="1" w:styleId="EDFEDACFAFC34FD2AEF5BA27D09B769C">
+    <w:name w:val="EDFEDACFAFC34FD2AEF5BA27D09B769C"/>
+    <w:rsid w:val="00571490"/>
+  </w:style>
+  <w:style w:type="paragraph" w:customStyle="1" w:styleId="6C99B533CA7B43078211D5486CB2916C">
+    <w:name w:val="6C99B533CA7B43078211D5486CB2916C"/>
+    <w:rsid w:val="00571490"/>
+  </w:style>
+  <w:style w:type="paragraph" w:customStyle="1" w:styleId="A84C5E02F95A47E7AA977D72FFD89FE7">
+    <w:name w:val="A84C5E02F95A47E7AA977D72FFD89FE7"/>
+    <w:rsid w:val="00571490"/>
+  </w:style>
+  <w:style w:type="paragraph" w:customStyle="1" w:styleId="5277DA481B304AF6982BFC95CA002113">
+    <w:name w:val="5277DA481B304AF6982BFC95CA002113"/>
+    <w:rsid w:val="00571490"/>
+  </w:style>
+  <w:style w:type="paragraph" w:customStyle="1" w:styleId="BD6514AEFB224A23A2EC8AAD41EF89E9">
+    <w:name w:val="BD6514AEFB224A23A2EC8AAD41EF89E9"/>
+    <w:rsid w:val="00571490"/>
+  </w:style>
+  <w:style w:type="paragraph" w:customStyle="1" w:styleId="B5A5C1151638420FBD848837CDB5427D">
+    <w:name w:val="B5A5C1151638420FBD848837CDB5427D"/>
+    <w:rsid w:val="00571490"/>
+  </w:style>
+  <w:style w:type="paragraph" w:customStyle="1" w:styleId="B0CFE962B5C84FB4BE6B4715FE5D6C34">
+    <w:name w:val="B0CFE962B5C84FB4BE6B4715FE5D6C34"/>
+    <w:rsid w:val="00571490"/>
+  </w:style>
+  <w:style w:type="paragraph" w:customStyle="1" w:styleId="6D0CBF8B4CB542D89F2741740A546DDE">
+    <w:name w:val="6D0CBF8B4CB542D89F2741740A546DDE"/>
+    <w:rsid w:val="00571490"/>
+  </w:style>
+  <w:style w:type="paragraph" w:customStyle="1" w:styleId="EF8E25F7B1F447F5820B999373A86E1E">
+    <w:name w:val="EF8E25F7B1F447F5820B999373A86E1E"/>
+    <w:rsid w:val="00571490"/>
+  </w:style>
+  <w:style w:type="paragraph" w:customStyle="1" w:styleId="A8DA53B433624045A7CBC298DD27CA19">
+    <w:name w:val="A8DA53B433624045A7CBC298DD27CA19"/>
+    <w:rsid w:val="00571490"/>
+  </w:style>
+  <w:style w:type="paragraph" w:customStyle="1" w:styleId="34083644C79D4AB6AB07BE4AFD29C24B">
+    <w:name w:val="34083644C79D4AB6AB07BE4AFD29C24B"/>
+    <w:rsid w:val="00571490"/>
+  </w:style>
+  <w:style w:type="paragraph" w:customStyle="1" w:styleId="7500D7BE80D14BC7A158958B4961AF74">
+    <w:name w:val="7500D7BE80D14BC7A158958B4961AF74"/>
+    <w:rsid w:val="00571490"/>
+  </w:style>
+  <w:style w:type="paragraph" w:customStyle="1" w:styleId="FE5BCFB21C67452CBE92CBB968BFF9CF">
+    <w:name w:val="FE5BCFB21C67452CBE92CBB968BFF9CF"/>
+    <w:rsid w:val="00571490"/>
+  </w:style>
+  <w:style w:type="paragraph" w:customStyle="1" w:styleId="74D09A8EA05442439EEE08E96C7EBEE6">
+    <w:name w:val="74D09A8EA05442439EEE08E96C7EBEE6"/>
+    <w:rsid w:val="00571490"/>
+  </w:style>
+  <w:style w:type="paragraph" w:customStyle="1" w:styleId="95B01F7740EC455C8A839180A1F87315">
+    <w:name w:val="95B01F7740EC455C8A839180A1F87315"/>
+    <w:rsid w:val="00571490"/>
+  </w:style>
+  <w:style w:type="paragraph" w:customStyle="1" w:styleId="6E4AAF7D839A45A083832CB72AB50D7F">
+    <w:name w:val="6E4AAF7D839A45A083832CB72AB50D7F"/>
+    <w:rsid w:val="00571490"/>
+  </w:style>
+  <w:style w:type="paragraph" w:customStyle="1" w:styleId="A923252F19C1498C90DFF2F675813A4E">
+    <w:name w:val="A923252F19C1498C90DFF2F675813A4E"/>
+    <w:rsid w:val="00571490"/>
+  </w:style>
+  <w:style w:type="paragraph" w:customStyle="1" w:styleId="965D5AC2E410419ABE27C128B3BC2B2B">
+    <w:name w:val="965D5AC2E410419ABE27C128B3BC2B2B"/>
+    <w:rsid w:val="00571490"/>
+  </w:style>
+  <w:style w:type="paragraph" w:customStyle="1" w:styleId="7D1CDCF3D94C480593674BA44C88DABC">
+    <w:name w:val="7D1CDCF3D94C480593674BA44C88DABC"/>
+    <w:rsid w:val="00571490"/>
+  </w:style>
+  <w:style w:type="paragraph" w:customStyle="1" w:styleId="F547F88D76CC462EBE3382785AD47080">
+    <w:name w:val="F547F88D76CC462EBE3382785AD47080"/>
+    <w:rsid w:val="00571490"/>
   </w:style>
 </w:styles>
 </file>
@@ -1799,7 +2143,7 @@
 </a:theme>
 </file>
 
-<file path=customXml/item1.xml>��< ? x m l   v e r s i o n = " 1 . 0 "   e n c o d i n g = " u t f - 1 6 " ? > < N a v W o r d R e p o r t X m l P a r t   x m l n s = " u r n : m i c r o s o f t - d y n a m i c s - n a v / r e p o r t s / G o l d _ C u s t o m e r _ R e p o r t / 5 0 1 1 0 / " > +<file path=customXml/item1.xml>��< ? x m l   v e r s i o n = " 1 . 0 "   e n c o d i n g = " u t f - 1 6 " ? > < N a v W o r d R e p o r t X m l P a r t   x m l n s = " u r n : m i c r o s o f t - d y n a m i c s - b u s i n e s s c e n t r a l / i n t e r n a l / e x t e n d e d / r e p o r t s / G o l d _ C u s t o m e r _ R e p o r t / 5 0 1 1 0 / " >   
      < B C R e p o r t I n f o r m a t i o n >   
@@ -1865,24 +2209,60 @@
  
      < / B C R e p o r t I n f o r m a t i o n >   
-     < C u s t o m e r > - 
-         < B a l a n c e L C Y > B a l a n c e L C Y < / B a l a n c e L C Y > - 
-         < C r e d i t L i m i t L C Y > C r e d i t L i m i t L C Y < / C r e d i t L i m i t L C Y > - 
-         < C u s t o m e r P o s t i n g G r o u p > C u s t o m e r P o s t i n g G r o u p < / C u s t o m e r P o s t i n g G r o u p > - 
-         < N a m e > N a m e < / N a m e > - 
-         < N o > N o < / N o > +     < T o o l t i p s > + 
+         < T o o l t i p   c o l u m n = " N o "   E l e m e n t I d = " 1 1 9 8 2 6 8 3 4 0 " > + 
+             < T o o l t i p T e x t   l a n g = " e n - U S " > S p e c i f i e s   t h e   n u m b e r   o f   t h e   c u s t o m e r .   T h e   f i e l d   i s   e i t h e r   f i l l e d   a u t o m a t i c a l l y   f r o m   a   d e f i n e d   n u m b e r   s e r i e s ,   o r   y o u   e n t e r   t h e   n u m b e r   m a n u a l l y   b e c a u s e   y o u   h a v e   e n a b l e d   m a n u a l   n u m b e r   e n t r y   i n   t h e   n u m b e r - s e r i e s   s e t u p . < / T o o l t i p T e x t > + 
+         < / T o o l t i p > + 
+         < T o o l t i p   c o l u m n = " N a m e "   E l e m e n t I d = " 8 1 4 0 6 8 7 0 6 " > + 
+             < T o o l t i p T e x t   l a n g = " e n - U S " > S p e c i f i e s   t h e   c u s t o m e r ' s   n a m e   t h a t   a p p e a r s   o n   a l l   r e l a t e d   d o c u m e n t s .   F o r   c o m p a n i e s ,   s p e c i f y   t h e   c o m p a n y ' s   n a m e   h e r e ,   a n d   t h e n   a d d   t h e   r e l e v a n t   p e o p l e   a s   c o n t a c t s   t h a t   y o u   l i n k   t o   t h i s   c u s t o m e r . < / T o o l t i p T e x t > + 
+         < / T o o l t i p > + 
+         < T o o l t i p   c o l u m n = " B a l a n c e L C Y "   E l e m e n t I d = " 5 0 0 1 8 9 8 9 9 " > + 
+             < T o o l t i p T e x t   l a n g = " e n - U S " > S p e c i f i e s   t h e   p a y m e n t   a m o u n t   t h a t   t h e   c u s t o m e r   o w e s   f o r   c o m p l e t e d   s a l e s .   T h i s   v a l u e   i s   a l s o   k n o w n   a s   t h e   c u s t o m e r ' s   b a l a n c e . < / T o o l t i p T e x t > + 
+         < / T o o l t i p > + 
+         < T o o l t i p   c o l u m n = " C u s t o m e r P o s t i n g G r o u p "   E l e m e n t I d = " 2 1 1 6 9 0 2 2 1 0 " > + 
+             < T o o l t i p T e x t   l a n g = " e n - U S " > S p e c i f i e s   t h e   c u s t o m e r ' s   m a r k e t   t y p e   t o   l i n k   b u s i n e s s   t r a n s a c t i o n s   t o . < / T o o l t i p T e x t > + 
+         < / T o o l t i p > + 
+         < T o o l t i p   c o l u m n = " C r e d i t L i m i t L C Y "   E l e m e n t I d = " 1 9 2 4 5 2 2 8 5 1 " > + 
+             < T o o l t i p T e x t   l a n g = " e n - U S " > S p e c i f i e s   t h e   m a x i m u m   a m o u n t   o f   c r e d i t   t h a t   y o u   e x t e n d   t o   t h e   c u s t o m e r   f o r   t h e i r   p u r c h a s e s   b e f o r e   y o u   i s s u e   w a r n i n g s .   T h e   v a l u e   0   r e p r e s e n t s   u n l i m i t e d   c r e d i t . < / T o o l t i p T e x t > + 
+         < / T o o l t i p > + 
+     < / T o o l t i p s > + 
+     < C u s t o m e r   E l e m e n t T y p e = " D a t a I t e m "   E l e m e n t I d = " 1 5 2 5 1 9 1 9 9 " > + 
+         < B a l a n c e L C Y   E l e m e n t T y p e = " C o l u m n "   E l e m e n t I d = " 5 0 0 1 8 9 8 9 9 "   D a t a T y p e = " D e c i m a l " > B a l a n c e L C Y < / B a l a n c e L C Y > + 
+         < C r e d i t L i m i t L C Y   E l e m e n t T y p e = " C o l u m n "   E l e m e n t I d = " 1 9 2 4 5 2 2 8 5 1 "   D a t a T y p e = " D e c i m a l " > C r e d i t L i m i t L C Y < / C r e d i t L i m i t L C Y > + 
+         < C u s t o m e r P o s t i n g G r o u p   E l e m e n t T y p e = " C o l u m n "   E l e m e n t I d = " 2 1 1 6 9 0 2 2 1 0 "   D a t a T y p e = " C o d e " > C u s t o m e r P o s t i n g G r o u p < / C u s t o m e r P o s t i n g G r o u p > + 
+         < N a m e   E l e m e n t T y p e = " C o l u m n "   E l e m e n t I d = " 8 1 4 0 6 8 7 0 6 "   D a t a T y p e = " T e x t " > N a m e < / N a m e > + 
+         < N o   E l e m e n t T y p e = " C o l u m n "   E l e m e n t I d = " 1 1 9 8 2 6 8 3 4 0 "   D a t a T y p e = " C o d e " > N o < / N o > + 
+         < R o w N o   E l e m e n t T y p e = " C o l u m n "   E l e m e n t I d = " 1 0 4 1 2 8 3 7 4 "   D a t a T y p e = " I n t e g e r " > R o w N o < / R o w N o >   
      < / C u s t o m e r >   
  < / N a v W o r d R e p o r t X m l P a r t > 
 </file>
 
-<file path=customXml/item2.xml>��< ? x m l   v e r s i o n = " 1 . 0 "   e n c o d i n g = " u t f - 1 6 " ? > < N a v W o r d R e p o r t X m l P a r t   x m l n s = " u r n : m i c r o s o f t - d y n a m i c s - b u s i n e s s c e n t r a l / i n t e r n a l / e x t e n d e d / r e p o r t s / G o l d _ C u s t o m e r _ R e p o r t / 5 0 1 1 0 / " > +<file path=customXml/item2.xml>��< ? x m l   v e r s i o n = " 1 . 0 "   e n c o d i n g = " u t f - 1 6 " ? > < N a v W o r d R e p o r t X m l P a r t   x m l n s = " u r n : m i c r o s o f t - d y n a m i c s - n a v / r e p o r t s / G o l d _ C u s t o m e r _ R e p o r t / 5 0 1 1 0 / " >   
      < B C R e p o r t I n f o r m a t i o n >   
@@ -1948,51 +2328,19 @@
  
      < / B C R e p o r t I n f o r m a t i o n >   
-     < T o o l t i p s > - 
-         < T o o l t i p   c o l u m n = " N o "   E l e m e n t I d = " 1 1 9 8 2 6 8 3 4 0 " > - 
-             < T o o l t i p T e x t   l a n g = " e n - U S " > S p e c i f i e s   t h e   n u m b e r   o f   t h e   c u s t o m e r .   T h e   f i e l d   i s   e i t h e r   f i l l e d   a u t o m a t i c a l l y   f r o m   a   d e f i n e d   n u m b e r   s e r i e s ,   o r   y o u   e n t e r   t h e   n u m b e r   m a n u a l l y   b e c a u s e   y o u   h a v e   e n a b l e d   m a n u a l   n u m b e r   e n t r y   i n   t h e   n u m b e r - s e r i e s   s e t u p . < / T o o l t i p T e x t > - 
-         < / T o o l t i p > - 
-         < T o o l t i p   c o l u m n = " N a m e "   E l e m e n t I d = " 8 1 4 0 6 8 7 0 6 " > - 
-             < T o o l t i p T e x t   l a n g = " e n - U S " > S p e c i f i e s   t h e   c u s t o m e r ' s   n a m e   t h a t   a p p e a r s   o n   a l l   r e l a t e d   d o c u m e n t s .   F o r   c o m p a n i e s ,   s p e c i f y   t h e   c o m p a n y ' s   n a m e   h e r e ,   a n d   t h e n   a d d   t h e   r e l e v a n t   p e o p l e   a s   c o n t a c t s   t h a t   y o u   l i n k   t o   t h i s   c u s t o m e r . < / T o o l t i p T e x t > - 
-         < / T o o l t i p > - 
-         < T o o l t i p   c o l u m n = " B a l a n c e L C Y "   E l e m e n t I d = " 5 0 0 1 8 9 8 9 9 " > - 
-             < T o o l t i p T e x t   l a n g = " e n - U S " > S p e c i f i e s   t h e   p a y m e n t   a m o u n t   t h a t   t h e   c u s t o m e r   o w e s   f o r   c o m p l e t e d   s a l e s .   T h i s   v a l u e   i s   a l s o   k n o w n   a s   t h e   c u s t o m e r ' s   b a l a n c e . < / T o o l t i p T e x t > - 
-         < / T o o l t i p > - 
-         < T o o l t i p   c o l u m n = " C u s t o m e r P o s t i n g G r o u p "   E l e m e n t I d = " 2 1 1 6 9 0 2 2 1 0 " > - 
-             < T o o l t i p T e x t   l a n g = " e n - U S " > S p e c i f i e s   t h e   c u s t o m e r ' s   m a r k e t   t y p e   t o   l i n k   b u s i n e s s   t r a n s a c t i o n s   t o . < / T o o l t i p T e x t > - 
-         < / T o o l t i p > - 
-         < T o o l t i p   c o l u m n = " C r e d i t L i m i t L C Y "   E l e m e n t I d = " 1 9 2 4 5 2 2 8 5 1 " > - 
-             < T o o l t i p T e x t   l a n g = " e n - U S " > S p e c i f i e s   t h e   m a x i m u m   a m o u n t   o f   c r e d i t   t h a t   y o u   e x t e n d   t o   t h e   c u s t o m e r   f o r   t h e i r   p u r c h a s e s   b e f o r e   y o u   i s s u e   w a r n i n g s .   T h e   v a l u e   0   r e p r e s e n t s   u n l i m i t e d   c r e d i t . < / T o o l t i p T e x t > - 
-         < / T o o l t i p > - 
-     < / T o o l t i p s > - 
-     < C u s t o m e r   E l e m e n t T y p e = " D a t a I t e m "   E l e m e n t I d = " 1 5 2 5 1 9 1 9 9 " > - 
-         < B a l a n c e L C Y   E l e m e n t T y p e = " C o l u m n "   E l e m e n t I d = " 5 0 0 1 8 9 8 9 9 "   D a t a T y p e = " D e c i m a l " > B a l a n c e L C Y < / B a l a n c e L C Y > - 
-         < C r e d i t L i m i t L C Y   E l e m e n t T y p e = " C o l u m n "   E l e m e n t I d = " 1 9 2 4 5 2 2 8 5 1 "   D a t a T y p e = " D e c i m a l " > C r e d i t L i m i t L C Y < / C r e d i t L i m i t L C Y > - 
-         < C u s t o m e r P o s t i n g G r o u p   E l e m e n t T y p e = " C o l u m n "   E l e m e n t I d = " 2 1 1 6 9 0 2 2 1 0 "   D a t a T y p e = " C o d e " > C u s t o m e r P o s t i n g G r o u p < / C u s t o m e r P o s t i n g G r o u p > - 
-         < N a m e   E l e m e n t T y p e = " C o l u m n "   E l e m e n t I d = " 8 1 4 0 6 8 7 0 6 "   D a t a T y p e = " T e x t " > N a m e < / N a m e > - 
-         < N o   E l e m e n t T y p e = " C o l u m n "   E l e m e n t I d = " 1 1 9 8 2 6 8 3 4 0 "   D a t a T y p e = " C o d e " > N o < / N o > +     < C u s t o m e r > + 
+         < B a l a n c e L C Y > B a l a n c e L C Y < / B a l a n c e L C Y > + 
+         < C r e d i t L i m i t L C Y > C r e d i t L i m i t L C Y < / C r e d i t L i m i t L C Y > + 
+         < C u s t o m e r P o s t i n g G r o u p > C u s t o m e r P o s t i n g G r o u p < / C u s t o m e r P o s t i n g G r o u p > + 
+         < N a m e > N a m e < / N a m e > + 
+         < N o > N o < / N o > + 
+         < R o w N o > R o w N o < / R o w N o >   
      < / C u s t o m e r >   
@@ -2000,17 +2348,17 @@
 </file>
 
 <file path=customXml/itemProps1.xml><?xml version="1.0" encoding="utf-8"?>
+<ds:datastoreItem xmlns:ds="http://schemas.openxmlformats.org/officeDocument/2006/customXml" ds:itemID="{91ECF522-4F59-46E9-A54A-AEFF76E14CA1}">
+  <ds:schemaRefs>
+    <ds:schemaRef ds:uri="urn:microsoft-dynamics-businesscentral/internal/extended/reports/Gold_Customer_Report/50110/"/>
+  </ds:schemaRefs>
+</ds:datastoreItem>
+</file>
+
+<file path=customXml/itemProps2.xml><?xml version="1.0" encoding="utf-8"?>
 <ds:datastoreItem xmlns:ds="http://schemas.openxmlformats.org/officeDocument/2006/customXml" ds:itemID="{A6B69A3E-D27D-4DC1-B85E-6A3637EC02EF}">
   <ds:schemaRefs>
     <ds:schemaRef ds:uri="urn:microsoft-dynamics-nav/reports/Gold_Customer_Report/50110/"/>
   </ds:schemaRefs>
 </ds:datastoreItem>
-</file>
-
-<file path=customXml/itemProps2.xml><?xml version="1.0" encoding="utf-8"?>
-<ds:datastoreItem xmlns:ds="http://schemas.openxmlformats.org/officeDocument/2006/customXml" ds:itemID="{91ECF522-4F59-46E9-A54A-AEFF76E14CA1}">
-  <ds:schemaRefs>
-    <ds:schemaRef ds:uri="urn:microsoft-dynamics-businesscentral/internal/extended/reports/Gold_Customer_Report/50110/"/>
-  </ds:schemaRefs>
-</ds:datastoreItem>
 </file>
</xml_diff>